<commit_message>
pt-PT: reconcile contents page with chapter titles
Align 6 table-of-contents entries to the localizers' refined pt-PT chapter
titles (New Jersey, O Guardiao do Meu Irmao, A Armadilha da Performance,
Marcar as Caixas, ...Encontra..., O Palacio Salmao). Rebuild.

Co-Authored-By: Claude Opus 4.8 <noreply@anthropic.com>
Claude-Session: https://claude.ai/code/session_013TTacQAr67Pe2VUwTPop1A
</commit_message>
<xml_diff>
--- a/The_Cardinals_Promise_PT_PT.docx
+++ b/The_Cardinals_Promise_PT_PT.docx
@@ -336,7 +336,7 @@
         <w:pStyle w:val="Compact"/>
       </w:pPr>
       <w:r>
-        <w:t xml:space="preserve">Nova Jersey: Sobrevivência</w:t>
+        <w:t xml:space="preserve">New Jersey: Sobrevivência</w:t>
       </w:r>
     </w:p>
     <w:p>
@@ -480,7 +480,7 @@
         <w:pStyle w:val="Compact"/>
       </w:pPr>
       <w:r>
-        <w:t xml:space="preserve">Guardião do Meu Irmão</w:t>
+        <w:t xml:space="preserve">O Guardião do Meu Irmão</w:t>
       </w:r>
     </w:p>
     <w:p>
@@ -492,7 +492,7 @@
         <w:pStyle w:val="Compact"/>
       </w:pPr>
       <w:r>
-        <w:t xml:space="preserve">A Armadilha do Desempenho</w:t>
+        <w:t xml:space="preserve">A Armadilha da Performance</w:t>
       </w:r>
     </w:p>
     <w:p>
@@ -504,7 +504,7 @@
         <w:pStyle w:val="Compact"/>
       </w:pPr>
       <w:r>
-        <w:t xml:space="preserve">Marcando Caixinhas</w:t>
+        <w:t xml:space="preserve">Marcar as Caixas</w:t>
       </w:r>
     </w:p>
     <w:p>
@@ -576,7 +576,7 @@
         <w:pStyle w:val="Compact"/>
       </w:pPr>
       <w:r>
-        <w:t xml:space="preserve">As Pessoas Que Você Conhece Quando Para de Beber</w:t>
+        <w:t xml:space="preserve">As Pessoas Que Você Encontra Quando Para de Beber</w:t>
       </w:r>
     </w:p>
     <w:p>
@@ -612,7 +612,7 @@
         <w:pStyle w:val="Compact"/>
       </w:pPr>
       <w:r>
-        <w:t xml:space="preserve">O Palácio do Salmão</w:t>
+        <w:t xml:space="preserve">O Palácio Salmão</w:t>
       </w:r>
     </w:p>
     <w:p>

</xml_diff>